<commit_message>
docs: Edit document file
</commit_message>
<xml_diff>
--- a/GroupProject.docx
+++ b/GroupProject.docx
@@ -212,21 +212,7 @@
           <w:sz w:val="24"/>
           <w:szCs w:val="24"/>
         </w:rPr>
-        <w:t xml:space="preserve"> or the</w:t>
-      </w:r>
-      <w:r>
-        <w:rPr>
-          <w:sz w:val="24"/>
-          <w:szCs w:val="24"/>
-        </w:rPr>
-        <w:t xml:space="preserve"> </w:t>
-      </w:r>
-      <w:r>
-        <w:rPr>
-          <w:sz w:val="24"/>
-          <w:szCs w:val="24"/>
-        </w:rPr>
-        <w:t>automatically generated Swagger UI available at http://localhost:3000/swagger. The latter is made possible by the @elysiajs/swagger package.</w:t>
+        <w:t xml:space="preserve"> or the automatically generated Swagger UI available at http://localhost:3000/swagger. The latter is made possible by the @elysiajs/swagger package.</w:t>
       </w:r>
     </w:p>
     <w:p>
@@ -687,7 +673,21 @@
                 <w:sz w:val="24"/>
                 <w:szCs w:val="24"/>
               </w:rPr>
-              <w:t>API root — returns service info and resource links</w:t>
+              <w:t xml:space="preserve">API root </w:t>
+            </w:r>
+            <w:r>
+              <w:rPr>
+                <w:sz w:val="24"/>
+                <w:szCs w:val="24"/>
+              </w:rPr>
+              <w:t xml:space="preserve">- </w:t>
+            </w:r>
+            <w:r>
+              <w:rPr>
+                <w:sz w:val="24"/>
+                <w:szCs w:val="24"/>
+              </w:rPr>
+              <w:t>returns service info and resource links</w:t>
             </w:r>
           </w:p>
         </w:tc>
@@ -729,8 +729,17 @@
                 <w:sz w:val="24"/>
                 <w:szCs w:val="24"/>
               </w:rPr>
-              <w:t>/health</w:t>
-            </w:r>
+              <w:t>/</w:t>
+            </w:r>
+            <w:proofErr w:type="gramStart"/>
+            <w:r>
+              <w:rPr>
+                <w:sz w:val="24"/>
+                <w:szCs w:val="24"/>
+              </w:rPr>
+              <w:t>health</w:t>
+            </w:r>
+            <w:proofErr w:type="gramEnd"/>
           </w:p>
         </w:tc>
         <w:tc>
@@ -769,7 +778,21 @@
                 <w:sz w:val="24"/>
                 <w:szCs w:val="24"/>
               </w:rPr>
-              <w:t>Health check — returns {status: ok}</w:t>
+              <w:t xml:space="preserve">Health check </w:t>
+            </w:r>
+            <w:r>
+              <w:rPr>
+                <w:sz w:val="24"/>
+                <w:szCs w:val="24"/>
+              </w:rPr>
+              <w:t xml:space="preserve">- </w:t>
+            </w:r>
+            <w:r>
+              <w:rPr>
+                <w:sz w:val="24"/>
+                <w:szCs w:val="24"/>
+              </w:rPr>
+              <w:t>returns {status: ok}</w:t>
             </w:r>
           </w:p>
         </w:tc>
@@ -811,21 +834,9 @@
                 <w:sz w:val="24"/>
                 <w:szCs w:val="24"/>
               </w:rPr>
-              <w:t>/users</w:t>
-            </w:r>
-          </w:p>
-        </w:tc>
-        <w:tc>
-          <w:tcPr>
-            <w:tcW w:w="0" w:type="auto"/>
-          </w:tcPr>
-          <w:p>
-            <w:pPr>
-              <w:rPr>
-                <w:sz w:val="24"/>
-                <w:szCs w:val="24"/>
-              </w:rPr>
-            </w:pPr>
+              <w:t>/</w:t>
+            </w:r>
+            <w:proofErr w:type="gramStart"/>
             <w:r>
               <w:rPr>
                 <w:sz w:val="24"/>
@@ -833,25 +844,60 @@
               </w:rPr>
               <w:t>users</w:t>
             </w:r>
-          </w:p>
-        </w:tc>
-        <w:tc>
-          <w:tcPr>
-            <w:tcW w:w="0" w:type="auto"/>
-          </w:tcPr>
-          <w:p>
-            <w:pPr>
-              <w:rPr>
-                <w:sz w:val="24"/>
-                <w:szCs w:val="24"/>
-              </w:rPr>
-            </w:pPr>
-            <w:r>
-              <w:rPr>
-                <w:sz w:val="24"/>
-                <w:szCs w:val="24"/>
-              </w:rPr>
-              <w:t xml:space="preserve">List users — supports page, </w:t>
+            <w:proofErr w:type="gramEnd"/>
+          </w:p>
+        </w:tc>
+        <w:tc>
+          <w:tcPr>
+            <w:tcW w:w="0" w:type="auto"/>
+          </w:tcPr>
+          <w:p>
+            <w:pPr>
+              <w:rPr>
+                <w:sz w:val="24"/>
+                <w:szCs w:val="24"/>
+              </w:rPr>
+            </w:pPr>
+            <w:r>
+              <w:rPr>
+                <w:sz w:val="24"/>
+                <w:szCs w:val="24"/>
+              </w:rPr>
+              <w:t>users</w:t>
+            </w:r>
+          </w:p>
+        </w:tc>
+        <w:tc>
+          <w:tcPr>
+            <w:tcW w:w="0" w:type="auto"/>
+          </w:tcPr>
+          <w:p>
+            <w:pPr>
+              <w:rPr>
+                <w:sz w:val="24"/>
+                <w:szCs w:val="24"/>
+              </w:rPr>
+            </w:pPr>
+            <w:r>
+              <w:rPr>
+                <w:sz w:val="24"/>
+                <w:szCs w:val="24"/>
+              </w:rPr>
+              <w:t xml:space="preserve">List users </w:t>
+            </w:r>
+            <w:r>
+              <w:rPr>
+                <w:sz w:val="24"/>
+                <w:szCs w:val="24"/>
+              </w:rPr>
+              <w:t xml:space="preserve">- </w:t>
+            </w:r>
+            <w:r>
+              <w:rPr>
+                <w:sz w:val="24"/>
+                <w:szCs w:val="24"/>
+              </w:rPr>
+              <w:t xml:space="preserve">supports page, </w:t>
             </w:r>
             <w:proofErr w:type="spellStart"/>
             <w:r>
@@ -909,8 +955,17 @@
                 <w:sz w:val="24"/>
                 <w:szCs w:val="24"/>
               </w:rPr>
-              <w:t>/users</w:t>
-            </w:r>
+              <w:t>/</w:t>
+            </w:r>
+            <w:proofErr w:type="gramStart"/>
+            <w:r>
+              <w:rPr>
+                <w:sz w:val="24"/>
+                <w:szCs w:val="24"/>
+              </w:rPr>
+              <w:t>users</w:t>
+            </w:r>
+            <w:proofErr w:type="gramEnd"/>
           </w:p>
         </w:tc>
         <w:tc>
@@ -1237,21 +1292,9 @@
                 <w:sz w:val="24"/>
                 <w:szCs w:val="24"/>
               </w:rPr>
-              <w:t>/projects</w:t>
-            </w:r>
-          </w:p>
-        </w:tc>
-        <w:tc>
-          <w:tcPr>
-            <w:tcW w:w="0" w:type="auto"/>
-          </w:tcPr>
-          <w:p>
-            <w:pPr>
-              <w:rPr>
-                <w:sz w:val="24"/>
-                <w:szCs w:val="24"/>
-              </w:rPr>
-            </w:pPr>
+              <w:t>/</w:t>
+            </w:r>
+            <w:proofErr w:type="gramStart"/>
             <w:r>
               <w:rPr>
                 <w:sz w:val="24"/>
@@ -1259,25 +1302,60 @@
               </w:rPr>
               <w:t>projects</w:t>
             </w:r>
-          </w:p>
-        </w:tc>
-        <w:tc>
-          <w:tcPr>
-            <w:tcW w:w="0" w:type="auto"/>
-          </w:tcPr>
-          <w:p>
-            <w:pPr>
-              <w:rPr>
-                <w:sz w:val="24"/>
-                <w:szCs w:val="24"/>
-              </w:rPr>
-            </w:pPr>
-            <w:r>
-              <w:rPr>
-                <w:sz w:val="24"/>
-                <w:szCs w:val="24"/>
-              </w:rPr>
-              <w:t xml:space="preserve">List projects — supports page, </w:t>
+            <w:proofErr w:type="gramEnd"/>
+          </w:p>
+        </w:tc>
+        <w:tc>
+          <w:tcPr>
+            <w:tcW w:w="0" w:type="auto"/>
+          </w:tcPr>
+          <w:p>
+            <w:pPr>
+              <w:rPr>
+                <w:sz w:val="24"/>
+                <w:szCs w:val="24"/>
+              </w:rPr>
+            </w:pPr>
+            <w:r>
+              <w:rPr>
+                <w:sz w:val="24"/>
+                <w:szCs w:val="24"/>
+              </w:rPr>
+              <w:t>projects</w:t>
+            </w:r>
+          </w:p>
+        </w:tc>
+        <w:tc>
+          <w:tcPr>
+            <w:tcW w:w="0" w:type="auto"/>
+          </w:tcPr>
+          <w:p>
+            <w:pPr>
+              <w:rPr>
+                <w:sz w:val="24"/>
+                <w:szCs w:val="24"/>
+              </w:rPr>
+            </w:pPr>
+            <w:r>
+              <w:rPr>
+                <w:sz w:val="24"/>
+                <w:szCs w:val="24"/>
+              </w:rPr>
+              <w:t xml:space="preserve">List projects </w:t>
+            </w:r>
+            <w:r>
+              <w:rPr>
+                <w:sz w:val="24"/>
+                <w:szCs w:val="24"/>
+              </w:rPr>
+              <w:t>-</w:t>
+            </w:r>
+            <w:r>
+              <w:rPr>
+                <w:sz w:val="24"/>
+                <w:szCs w:val="24"/>
+              </w:rPr>
+              <w:t xml:space="preserve"> supports page, </w:t>
             </w:r>
             <w:proofErr w:type="spellStart"/>
             <w:r>
@@ -1351,8 +1429,17 @@
                 <w:sz w:val="24"/>
                 <w:szCs w:val="24"/>
               </w:rPr>
-              <w:t>/projects</w:t>
-            </w:r>
+              <w:t>/</w:t>
+            </w:r>
+            <w:proofErr w:type="gramStart"/>
+            <w:r>
+              <w:rPr>
+                <w:sz w:val="24"/>
+                <w:szCs w:val="24"/>
+              </w:rPr>
+              <w:t>projects</w:t>
+            </w:r>
+            <w:proofErr w:type="gramEnd"/>
           </w:p>
         </w:tc>
         <w:tc>
@@ -1695,21 +1782,9 @@
                 <w:sz w:val="24"/>
                 <w:szCs w:val="24"/>
               </w:rPr>
-              <w:t>/tasks</w:t>
-            </w:r>
-          </w:p>
-        </w:tc>
-        <w:tc>
-          <w:tcPr>
-            <w:tcW w:w="0" w:type="auto"/>
-          </w:tcPr>
-          <w:p>
-            <w:pPr>
-              <w:rPr>
-                <w:sz w:val="24"/>
-                <w:szCs w:val="24"/>
-              </w:rPr>
-            </w:pPr>
+              <w:t>/</w:t>
+            </w:r>
+            <w:proofErr w:type="gramStart"/>
             <w:r>
               <w:rPr>
                 <w:sz w:val="24"/>
@@ -1717,25 +1792,60 @@
               </w:rPr>
               <w:t>tasks</w:t>
             </w:r>
-          </w:p>
-        </w:tc>
-        <w:tc>
-          <w:tcPr>
-            <w:tcW w:w="0" w:type="auto"/>
-          </w:tcPr>
-          <w:p>
-            <w:pPr>
-              <w:rPr>
-                <w:sz w:val="24"/>
-                <w:szCs w:val="24"/>
-              </w:rPr>
-            </w:pPr>
-            <w:r>
-              <w:rPr>
-                <w:sz w:val="24"/>
-                <w:szCs w:val="24"/>
-              </w:rPr>
-              <w:t xml:space="preserve">List tasks — supports page, </w:t>
+            <w:proofErr w:type="gramEnd"/>
+          </w:p>
+        </w:tc>
+        <w:tc>
+          <w:tcPr>
+            <w:tcW w:w="0" w:type="auto"/>
+          </w:tcPr>
+          <w:p>
+            <w:pPr>
+              <w:rPr>
+                <w:sz w:val="24"/>
+                <w:szCs w:val="24"/>
+              </w:rPr>
+            </w:pPr>
+            <w:r>
+              <w:rPr>
+                <w:sz w:val="24"/>
+                <w:szCs w:val="24"/>
+              </w:rPr>
+              <w:t>tasks</w:t>
+            </w:r>
+          </w:p>
+        </w:tc>
+        <w:tc>
+          <w:tcPr>
+            <w:tcW w:w="0" w:type="auto"/>
+          </w:tcPr>
+          <w:p>
+            <w:pPr>
+              <w:rPr>
+                <w:sz w:val="24"/>
+                <w:szCs w:val="24"/>
+              </w:rPr>
+            </w:pPr>
+            <w:r>
+              <w:rPr>
+                <w:sz w:val="24"/>
+                <w:szCs w:val="24"/>
+              </w:rPr>
+              <w:t>List tasks</w:t>
+            </w:r>
+            <w:r>
+              <w:rPr>
+                <w:sz w:val="24"/>
+                <w:szCs w:val="24"/>
+              </w:rPr>
+              <w:t>-</w:t>
+            </w:r>
+            <w:r>
+              <w:rPr>
+                <w:sz w:val="24"/>
+                <w:szCs w:val="24"/>
+              </w:rPr>
+              <w:t xml:space="preserve">supports page, </w:t>
             </w:r>
             <w:proofErr w:type="spellStart"/>
             <w:r>
@@ -1834,8 +1944,17 @@
                 <w:sz w:val="24"/>
                 <w:szCs w:val="24"/>
               </w:rPr>
-              <w:t>/tasks</w:t>
-            </w:r>
+              <w:t>/</w:t>
+            </w:r>
+            <w:proofErr w:type="gramStart"/>
+            <w:r>
+              <w:rPr>
+                <w:sz w:val="24"/>
+                <w:szCs w:val="24"/>
+              </w:rPr>
+              <w:t>tasks</w:t>
+            </w:r>
+            <w:proofErr w:type="gramEnd"/>
           </w:p>
         </w:tc>
         <w:tc>
@@ -2213,7 +2332,21 @@
           <w:sz w:val="24"/>
           <w:szCs w:val="24"/>
         </w:rPr>
-        <w:t>POST /users — Create User</w:t>
+        <w:t>POST /users</w:t>
+      </w:r>
+      <w:r>
+        <w:rPr>
+          <w:sz w:val="24"/>
+          <w:szCs w:val="24"/>
+        </w:rPr>
+        <w:t>-</w:t>
+      </w:r>
+      <w:r>
+        <w:rPr>
+          <w:sz w:val="24"/>
+          <w:szCs w:val="24"/>
+        </w:rPr>
+        <w:t>Create User</w:t>
       </w:r>
     </w:p>
     <w:p>
@@ -2238,7 +2371,73 @@
           <w:sz w:val="24"/>
           <w:szCs w:val="24"/>
         </w:rPr>
-        <w:t>Request body: { "email": "alex@example.com", "name": "Alex Kim" } Response (201 Created): { "id": 1, "email": "alex@example.com", "name": "Alex Kim", "</w:t>
+        <w:t xml:space="preserve">Request body: </w:t>
+      </w:r>
+      <w:proofErr w:type="gramStart"/>
+      <w:r>
+        <w:rPr>
+          <w:i/>
+          <w:iCs/>
+          <w:color w:val="156082" w:themeColor="accent1"/>
+          <w:sz w:val="24"/>
+          <w:szCs w:val="24"/>
+        </w:rPr>
+        <w:t>{ "</w:t>
+      </w:r>
+      <w:proofErr w:type="gramEnd"/>
+      <w:r>
+        <w:rPr>
+          <w:i/>
+          <w:iCs/>
+          <w:color w:val="156082" w:themeColor="accent1"/>
+          <w:sz w:val="24"/>
+          <w:szCs w:val="24"/>
+        </w:rPr>
+        <w:t>email": "alex@example.com", "name": "Alex Kim</w:t>
+      </w:r>
+      <w:proofErr w:type="gramStart"/>
+      <w:r>
+        <w:rPr>
+          <w:i/>
+          <w:iCs/>
+          <w:color w:val="156082" w:themeColor="accent1"/>
+          <w:sz w:val="24"/>
+          <w:szCs w:val="24"/>
+        </w:rPr>
+        <w:t>" }</w:t>
+      </w:r>
+      <w:proofErr w:type="gramEnd"/>
+      <w:r>
+        <w:rPr>
+          <w:i/>
+          <w:iCs/>
+          <w:color w:val="156082" w:themeColor="accent1"/>
+          <w:sz w:val="24"/>
+          <w:szCs w:val="24"/>
+        </w:rPr>
+        <w:t xml:space="preserve"> Response (201 Created): </w:t>
+      </w:r>
+      <w:proofErr w:type="gramStart"/>
+      <w:r>
+        <w:rPr>
+          <w:i/>
+          <w:iCs/>
+          <w:color w:val="156082" w:themeColor="accent1"/>
+          <w:sz w:val="24"/>
+          <w:szCs w:val="24"/>
+        </w:rPr>
+        <w:t>{ "</w:t>
+      </w:r>
+      <w:proofErr w:type="gramEnd"/>
+      <w:r>
+        <w:rPr>
+          <w:i/>
+          <w:iCs/>
+          <w:color w:val="156082" w:themeColor="accent1"/>
+          <w:sz w:val="24"/>
+          <w:szCs w:val="24"/>
+        </w:rPr>
+        <w:t>id": 1, "email": "alex@example.com", "name": "Alex Kim", "</w:t>
       </w:r>
       <w:proofErr w:type="spellStart"/>
       <w:r>
@@ -2260,8 +2459,20 @@
           <w:sz w:val="24"/>
           <w:szCs w:val="24"/>
         </w:rPr>
-        <w:t>": "2026-04-19 10:00:00" }</w:t>
-      </w:r>
+        <w:t>": "2026-04-19 10:00:00</w:t>
+      </w:r>
+      <w:proofErr w:type="gramStart"/>
+      <w:r>
+        <w:rPr>
+          <w:i/>
+          <w:iCs/>
+          <w:color w:val="156082" w:themeColor="accent1"/>
+          <w:sz w:val="24"/>
+          <w:szCs w:val="24"/>
+        </w:rPr>
+        <w:t>" }</w:t>
+      </w:r>
+      <w:proofErr w:type="gramEnd"/>
     </w:p>
     <w:p>
       <w:pPr>
@@ -2322,7 +2533,14 @@
           <w:sz w:val="24"/>
           <w:szCs w:val="24"/>
         </w:rPr>
-        <w:t xml:space="preserve">s — </w:t>
+        <w:t>s</w:t>
+      </w:r>
+      <w:r>
+        <w:rPr>
+          <w:sz w:val="24"/>
+          <w:szCs w:val="24"/>
+        </w:rPr>
+        <w:t>-</w:t>
       </w:r>
       <w:r>
         <w:rPr>
@@ -2600,7 +2818,51 @@
           <w:sz w:val="24"/>
           <w:szCs w:val="24"/>
         </w:rPr>
-        <w:t>All errors follow the same JSON envelope across every endpoint: // 404 Not Found { "error": { "code": "</w:t>
+        <w:t xml:space="preserve">All errors follow the same JSON envelope across every endpoint: // 404 Not Found </w:t>
+      </w:r>
+      <w:proofErr w:type="gramStart"/>
+      <w:r>
+        <w:rPr>
+          <w:i/>
+          <w:iCs/>
+          <w:color w:val="156082" w:themeColor="accent1"/>
+          <w:sz w:val="24"/>
+          <w:szCs w:val="24"/>
+        </w:rPr>
+        <w:t>{ "</w:t>
+      </w:r>
+      <w:proofErr w:type="gramEnd"/>
+      <w:r>
+        <w:rPr>
+          <w:i/>
+          <w:iCs/>
+          <w:color w:val="156082" w:themeColor="accent1"/>
+          <w:sz w:val="24"/>
+          <w:szCs w:val="24"/>
+        </w:rPr>
+        <w:t xml:space="preserve">error": </w:t>
+      </w:r>
+      <w:proofErr w:type="gramStart"/>
+      <w:r>
+        <w:rPr>
+          <w:i/>
+          <w:iCs/>
+          <w:color w:val="156082" w:themeColor="accent1"/>
+          <w:sz w:val="24"/>
+          <w:szCs w:val="24"/>
+        </w:rPr>
+        <w:t>{ "</w:t>
+      </w:r>
+      <w:proofErr w:type="gramEnd"/>
+      <w:r>
+        <w:rPr>
+          <w:i/>
+          <w:iCs/>
+          <w:color w:val="156082" w:themeColor="accent1"/>
+          <w:sz w:val="24"/>
+          <w:szCs w:val="24"/>
+        </w:rPr>
+        <w:t>code": "</w:t>
       </w:r>
       <w:proofErr w:type="spellStart"/>
       <w:r>
@@ -2622,7 +2884,73 @@
           <w:sz w:val="24"/>
           <w:szCs w:val="24"/>
         </w:rPr>
-        <w:t>", "message": "User not found." } } // 409 Conflict { "error": { "code": "</w:t>
+        <w:t>", "message": "User not found.</w:t>
+      </w:r>
+      <w:proofErr w:type="gramStart"/>
+      <w:r>
+        <w:rPr>
+          <w:i/>
+          <w:iCs/>
+          <w:color w:val="156082" w:themeColor="accent1"/>
+          <w:sz w:val="24"/>
+          <w:szCs w:val="24"/>
+        </w:rPr>
+        <w:t>" }</w:t>
+      </w:r>
+      <w:proofErr w:type="gramEnd"/>
+      <w:r>
+        <w:rPr>
+          <w:i/>
+          <w:iCs/>
+          <w:color w:val="156082" w:themeColor="accent1"/>
+          <w:sz w:val="24"/>
+          <w:szCs w:val="24"/>
+        </w:rPr>
+        <w:t xml:space="preserve"> } // 409 Conflict </w:t>
+      </w:r>
+      <w:proofErr w:type="gramStart"/>
+      <w:r>
+        <w:rPr>
+          <w:i/>
+          <w:iCs/>
+          <w:color w:val="156082" w:themeColor="accent1"/>
+          <w:sz w:val="24"/>
+          <w:szCs w:val="24"/>
+        </w:rPr>
+        <w:t>{ "</w:t>
+      </w:r>
+      <w:proofErr w:type="gramEnd"/>
+      <w:r>
+        <w:rPr>
+          <w:i/>
+          <w:iCs/>
+          <w:color w:val="156082" w:themeColor="accent1"/>
+          <w:sz w:val="24"/>
+          <w:szCs w:val="24"/>
+        </w:rPr>
+        <w:t xml:space="preserve">error": </w:t>
+      </w:r>
+      <w:proofErr w:type="gramStart"/>
+      <w:r>
+        <w:rPr>
+          <w:i/>
+          <w:iCs/>
+          <w:color w:val="156082" w:themeColor="accent1"/>
+          <w:sz w:val="24"/>
+          <w:szCs w:val="24"/>
+        </w:rPr>
+        <w:t>{ "</w:t>
+      </w:r>
+      <w:proofErr w:type="gramEnd"/>
+      <w:r>
+        <w:rPr>
+          <w:i/>
+          <w:iCs/>
+          <w:color w:val="156082" w:themeColor="accent1"/>
+          <w:sz w:val="24"/>
+          <w:szCs w:val="24"/>
+        </w:rPr>
+        <w:t>code": "</w:t>
       </w:r>
       <w:proofErr w:type="spellStart"/>
       <w:r>
@@ -2644,7 +2972,29 @@
           <w:sz w:val="24"/>
           <w:szCs w:val="24"/>
         </w:rPr>
-        <w:t xml:space="preserve">", "message": "A user with this email already exists." } } // 422 </w:t>
+        <w:t>", "message": "A user with this email already exists.</w:t>
+      </w:r>
+      <w:proofErr w:type="gramStart"/>
+      <w:r>
+        <w:rPr>
+          <w:i/>
+          <w:iCs/>
+          <w:color w:val="156082" w:themeColor="accent1"/>
+          <w:sz w:val="24"/>
+          <w:szCs w:val="24"/>
+        </w:rPr>
+        <w:t>" }</w:t>
+      </w:r>
+      <w:proofErr w:type="gramEnd"/>
+      <w:r>
+        <w:rPr>
+          <w:i/>
+          <w:iCs/>
+          <w:color w:val="156082" w:themeColor="accent1"/>
+          <w:sz w:val="24"/>
+          <w:szCs w:val="24"/>
+        </w:rPr>
+        <w:t xml:space="preserve"> } // 422 </w:t>
       </w:r>
       <w:proofErr w:type="spellStart"/>
       <w:r>
@@ -2666,7 +3016,51 @@
           <w:sz w:val="24"/>
           <w:szCs w:val="24"/>
         </w:rPr>
-        <w:t xml:space="preserve"> { "error": { "code": "</w:t>
+        <w:t xml:space="preserve"> </w:t>
+      </w:r>
+      <w:proofErr w:type="gramStart"/>
+      <w:r>
+        <w:rPr>
+          <w:i/>
+          <w:iCs/>
+          <w:color w:val="156082" w:themeColor="accent1"/>
+          <w:sz w:val="24"/>
+          <w:szCs w:val="24"/>
+        </w:rPr>
+        <w:t>{ "</w:t>
+      </w:r>
+      <w:proofErr w:type="gramEnd"/>
+      <w:r>
+        <w:rPr>
+          <w:i/>
+          <w:iCs/>
+          <w:color w:val="156082" w:themeColor="accent1"/>
+          <w:sz w:val="24"/>
+          <w:szCs w:val="24"/>
+        </w:rPr>
+        <w:t xml:space="preserve">error": </w:t>
+      </w:r>
+      <w:proofErr w:type="gramStart"/>
+      <w:r>
+        <w:rPr>
+          <w:i/>
+          <w:iCs/>
+          <w:color w:val="156082" w:themeColor="accent1"/>
+          <w:sz w:val="24"/>
+          <w:szCs w:val="24"/>
+        </w:rPr>
+        <w:t>{ "</w:t>
+      </w:r>
+      <w:proofErr w:type="gramEnd"/>
+      <w:r>
+        <w:rPr>
+          <w:i/>
+          <w:iCs/>
+          <w:color w:val="156082" w:themeColor="accent1"/>
+          <w:sz w:val="24"/>
+          <w:szCs w:val="24"/>
+        </w:rPr>
+        <w:t>code": "</w:t>
       </w:r>
       <w:proofErr w:type="spellStart"/>
       <w:r>
@@ -2710,7 +3104,29 @@
           <w:sz w:val="24"/>
           <w:szCs w:val="24"/>
         </w:rPr>
-        <w:t xml:space="preserve"> must reference an existing user." } }</w:t>
+        <w:t xml:space="preserve"> must reference an existing user.</w:t>
+      </w:r>
+      <w:proofErr w:type="gramStart"/>
+      <w:r>
+        <w:rPr>
+          <w:i/>
+          <w:iCs/>
+          <w:color w:val="156082" w:themeColor="accent1"/>
+          <w:sz w:val="24"/>
+          <w:szCs w:val="24"/>
+        </w:rPr>
+        <w:t>" }</w:t>
+      </w:r>
+      <w:proofErr w:type="gramEnd"/>
+      <w:r>
+        <w:rPr>
+          <w:i/>
+          <w:iCs/>
+          <w:color w:val="156082" w:themeColor="accent1"/>
+          <w:sz w:val="24"/>
+          <w:szCs w:val="24"/>
+        </w:rPr>
+        <w:t xml:space="preserve"> }</w:t>
       </w:r>
     </w:p>
     <w:p>
@@ -2967,8 +3383,20 @@
                 <w:sz w:val="24"/>
                 <w:szCs w:val="24"/>
               </w:rPr>
-              <w:t>When Returned</w:t>
-            </w:r>
+              <w:t xml:space="preserve">When </w:t>
+            </w:r>
+            <w:proofErr w:type="gramStart"/>
+            <w:r>
+              <w:rPr>
+                <w:b/>
+                <w:bCs/>
+                <w:color w:val="FFFFFF" w:themeColor="background1"/>
+                <w:sz w:val="24"/>
+                <w:szCs w:val="24"/>
+              </w:rPr>
+              <w:t>Returned</w:t>
+            </w:r>
+            <w:proofErr w:type="gramEnd"/>
           </w:p>
         </w:tc>
       </w:tr>
@@ -3458,7 +3886,21 @@
                 <w:sz w:val="24"/>
                 <w:szCs w:val="24"/>
               </w:rPr>
-              <w:t xml:space="preserve">Unexpected runtime errors — caught by global </w:t>
+              <w:t>Unexpected runtime errors</w:t>
+            </w:r>
+            <w:r>
+              <w:rPr>
+                <w:sz w:val="24"/>
+                <w:szCs w:val="24"/>
+              </w:rPr>
+              <w:t>-</w:t>
+            </w:r>
+            <w:r>
+              <w:rPr>
+                <w:sz w:val="24"/>
+                <w:szCs w:val="24"/>
+              </w:rPr>
+              <w:t xml:space="preserve">caught by global </w:t>
             </w:r>
             <w:proofErr w:type="spellStart"/>
             <w:r>
@@ -4765,8 +5207,17 @@
                 <w:sz w:val="24"/>
                 <w:szCs w:val="24"/>
               </w:rPr>
-              <w:t>/health</w:t>
-            </w:r>
+              <w:t>/</w:t>
+            </w:r>
+            <w:proofErr w:type="gramStart"/>
+            <w:r>
+              <w:rPr>
+                <w:sz w:val="24"/>
+                <w:szCs w:val="24"/>
+              </w:rPr>
+              <w:t>health</w:t>
+            </w:r>
+            <w:proofErr w:type="gramEnd"/>
           </w:p>
         </w:tc>
         <w:tc>
@@ -4890,8 +5341,17 @@
                 <w:sz w:val="24"/>
                 <w:szCs w:val="24"/>
               </w:rPr>
-              <w:t>/users</w:t>
-            </w:r>
+              <w:t>/</w:t>
+            </w:r>
+            <w:proofErr w:type="gramStart"/>
+            <w:r>
+              <w:rPr>
+                <w:sz w:val="24"/>
+                <w:szCs w:val="24"/>
+              </w:rPr>
+              <w:t>users</w:t>
+            </w:r>
+            <w:proofErr w:type="gramEnd"/>
           </w:p>
         </w:tc>
         <w:tc>
@@ -5034,12 +5494,21 @@
               <w:t>/</w:t>
             </w:r>
             <w:proofErr w:type="spellStart"/>
-            <w:r>
-              <w:rPr>
-                <w:sz w:val="24"/>
-                <w:szCs w:val="24"/>
-              </w:rPr>
-              <w:t>users?search</w:t>
+            <w:proofErr w:type="gramStart"/>
+            <w:r>
+              <w:rPr>
+                <w:sz w:val="24"/>
+                <w:szCs w:val="24"/>
+              </w:rPr>
+              <w:t>users</w:t>
+            </w:r>
+            <w:proofErr w:type="gramEnd"/>
+            <w:r>
+              <w:rPr>
+                <w:sz w:val="24"/>
+                <w:szCs w:val="24"/>
+              </w:rPr>
+              <w:t>?search</w:t>
             </w:r>
             <w:proofErr w:type="spellEnd"/>
             <w:r>
@@ -5172,8 +5641,17 @@
                 <w:sz w:val="24"/>
                 <w:szCs w:val="24"/>
               </w:rPr>
-              <w:t>/users</w:t>
-            </w:r>
+              <w:t>/</w:t>
+            </w:r>
+            <w:proofErr w:type="gramStart"/>
+            <w:r>
+              <w:rPr>
+                <w:sz w:val="24"/>
+                <w:szCs w:val="24"/>
+              </w:rPr>
+              <w:t>users</w:t>
+            </w:r>
+            <w:proofErr w:type="gramEnd"/>
           </w:p>
         </w:tc>
         <w:tc>
@@ -5672,8 +6150,17 @@
                 <w:sz w:val="24"/>
                 <w:szCs w:val="24"/>
               </w:rPr>
-              <w:t>/users</w:t>
-            </w:r>
+              <w:t>/</w:t>
+            </w:r>
+            <w:proofErr w:type="gramStart"/>
+            <w:r>
+              <w:rPr>
+                <w:sz w:val="24"/>
+                <w:szCs w:val="24"/>
+              </w:rPr>
+              <w:t>users</w:t>
+            </w:r>
+            <w:proofErr w:type="gramEnd"/>
           </w:p>
         </w:tc>
         <w:tc>
@@ -5797,8 +6284,17 @@
                 <w:sz w:val="24"/>
                 <w:szCs w:val="24"/>
               </w:rPr>
-              <w:t>/projects</w:t>
-            </w:r>
+              <w:t>/</w:t>
+            </w:r>
+            <w:proofErr w:type="gramStart"/>
+            <w:r>
+              <w:rPr>
+                <w:sz w:val="24"/>
+                <w:szCs w:val="24"/>
+              </w:rPr>
+              <w:t>projects</w:t>
+            </w:r>
+            <w:proofErr w:type="gramEnd"/>
           </w:p>
         </w:tc>
         <w:tc>
@@ -5941,12 +6437,21 @@
               <w:t>/</w:t>
             </w:r>
             <w:proofErr w:type="spellStart"/>
-            <w:r>
-              <w:rPr>
-                <w:sz w:val="24"/>
-                <w:szCs w:val="24"/>
-              </w:rPr>
-              <w:t>projects?status</w:t>
+            <w:proofErr w:type="gramStart"/>
+            <w:r>
+              <w:rPr>
+                <w:sz w:val="24"/>
+                <w:szCs w:val="24"/>
+              </w:rPr>
+              <w:t>projects</w:t>
+            </w:r>
+            <w:proofErr w:type="gramEnd"/>
+            <w:r>
+              <w:rPr>
+                <w:sz w:val="24"/>
+                <w:szCs w:val="24"/>
+              </w:rPr>
+              <w:t>?status</w:t>
             </w:r>
             <w:proofErr w:type="spellEnd"/>
             <w:r>
@@ -6079,8 +6584,17 @@
                 <w:sz w:val="24"/>
                 <w:szCs w:val="24"/>
               </w:rPr>
-              <w:t>/projects</w:t>
-            </w:r>
+              <w:t>/</w:t>
+            </w:r>
+            <w:proofErr w:type="gramStart"/>
+            <w:r>
+              <w:rPr>
+                <w:sz w:val="24"/>
+                <w:szCs w:val="24"/>
+              </w:rPr>
+              <w:t>projects</w:t>
+            </w:r>
+            <w:proofErr w:type="gramEnd"/>
           </w:p>
         </w:tc>
         <w:tc>
@@ -6454,8 +6968,17 @@
                 <w:sz w:val="24"/>
                 <w:szCs w:val="24"/>
               </w:rPr>
-              <w:t>/projects</w:t>
-            </w:r>
+              <w:t>/</w:t>
+            </w:r>
+            <w:proofErr w:type="gramStart"/>
+            <w:r>
+              <w:rPr>
+                <w:sz w:val="24"/>
+                <w:szCs w:val="24"/>
+              </w:rPr>
+              <w:t>projects</w:t>
+            </w:r>
+            <w:proofErr w:type="gramEnd"/>
           </w:p>
         </w:tc>
         <w:tc>
@@ -6579,8 +7102,17 @@
                 <w:sz w:val="24"/>
                 <w:szCs w:val="24"/>
               </w:rPr>
-              <w:t>/tasks</w:t>
-            </w:r>
+              <w:t>/</w:t>
+            </w:r>
+            <w:proofErr w:type="gramStart"/>
+            <w:r>
+              <w:rPr>
+                <w:sz w:val="24"/>
+                <w:szCs w:val="24"/>
+              </w:rPr>
+              <w:t>tasks</w:t>
+            </w:r>
+            <w:proofErr w:type="gramEnd"/>
           </w:p>
         </w:tc>
         <w:tc>
@@ -6733,12 +7265,21 @@
               <w:t>/</w:t>
             </w:r>
             <w:proofErr w:type="spellStart"/>
-            <w:r>
-              <w:rPr>
-                <w:sz w:val="24"/>
-                <w:szCs w:val="24"/>
-              </w:rPr>
-              <w:t>tasks?status</w:t>
+            <w:proofErr w:type="gramStart"/>
+            <w:r>
+              <w:rPr>
+                <w:sz w:val="24"/>
+                <w:szCs w:val="24"/>
+              </w:rPr>
+              <w:t>tasks</w:t>
+            </w:r>
+            <w:proofErr w:type="gramEnd"/>
+            <w:r>
+              <w:rPr>
+                <w:sz w:val="24"/>
+                <w:szCs w:val="24"/>
+              </w:rPr>
+              <w:t>?status</w:t>
             </w:r>
             <w:proofErr w:type="spellEnd"/>
             <w:r>
@@ -6899,12 +7440,21 @@
               <w:t>/</w:t>
             </w:r>
             <w:proofErr w:type="spellStart"/>
-            <w:r>
-              <w:rPr>
-                <w:sz w:val="24"/>
-                <w:szCs w:val="24"/>
-              </w:rPr>
-              <w:t>tasks?min_priority</w:t>
+            <w:proofErr w:type="gramStart"/>
+            <w:r>
+              <w:rPr>
+                <w:sz w:val="24"/>
+                <w:szCs w:val="24"/>
+              </w:rPr>
+              <w:t>tasks</w:t>
+            </w:r>
+            <w:proofErr w:type="gramEnd"/>
+            <w:r>
+              <w:rPr>
+                <w:sz w:val="24"/>
+                <w:szCs w:val="24"/>
+              </w:rPr>
+              <w:t>?min_priority</w:t>
             </w:r>
             <w:proofErr w:type="spellEnd"/>
             <w:r>
@@ -7037,8 +7587,17 @@
                 <w:sz w:val="24"/>
                 <w:szCs w:val="24"/>
               </w:rPr>
-              <w:t>/tasks</w:t>
-            </w:r>
+              <w:t>/</w:t>
+            </w:r>
+            <w:proofErr w:type="gramStart"/>
+            <w:r>
+              <w:rPr>
+                <w:sz w:val="24"/>
+                <w:szCs w:val="24"/>
+              </w:rPr>
+              <w:t>tasks</w:t>
+            </w:r>
+            <w:proofErr w:type="gramEnd"/>
           </w:p>
         </w:tc>
         <w:tc>
@@ -7662,8 +8221,17 @@
                 <w:sz w:val="24"/>
                 <w:szCs w:val="24"/>
               </w:rPr>
-              <w:t>/tasks</w:t>
-            </w:r>
+              <w:t>/</w:t>
+            </w:r>
+            <w:proofErr w:type="gramStart"/>
+            <w:r>
+              <w:rPr>
+                <w:sz w:val="24"/>
+                <w:szCs w:val="24"/>
+              </w:rPr>
+              <w:t>tasks</w:t>
+            </w:r>
+            <w:proofErr w:type="gramEnd"/>
           </w:p>
         </w:tc>
         <w:tc>
@@ -9865,6 +10433,7 @@
   <w:style w:type="character" w:default="1" w:styleId="DefaultParagraphFont">
     <w:name w:val="Default Paragraph Font"/>
     <w:uiPriority w:val="1"/>
+    <w:semiHidden/>
     <w:unhideWhenUsed/>
   </w:style>
   <w:style w:type="table" w:default="1" w:styleId="TableNormal">

</xml_diff>